<commit_message>
Romans 3rd-pass: 52 fixes (accuracy/reverse-check/consistency)
- EN accuracy: 3:27-28 MSG clause restore, 6:1-3 ref/summer-home/memo removal,
  6:6-11 cringey/owned slang, 8:18-21 joyful anticipation restore,
  9:10-13 'I hated Esau' restore, 11:7-10 David quote (KJV->MSG) + agency fix
- KO rewrites to EN/MSG: ch2 P4, ch4 P2/P11, ch5 P9, ch9 P4 (Pharaoh/hardening),
  ch11 P2/P6 (traditional renderings)
- KO additions removed: ch1 'God's team', ch2 'judge you', ch4 'time card',
  ch9 patriarchs/doxology/9:8 sentence
- Slang: squad goals, street smart (EN/KO), mic drop, cringey, 읽씹
- Duplication: ch10 P1 sentence (belongs to 4-10)
- Dropped content restored: ch8 P7, ch11 P14, ch13 P1 (KO), ch10 P4/P5 (KO)

validate_translation.py PASS (16 ch), build_gdocs VERIFY_DROPPED=0,
teen_without_msg=0, msg_orphans=0. Doc 1P0FwmCsgQ-JAMq-c0oomBHjciZfrf_7n8MxRexzbox0
updated, API 16/16, export-back verified.
</commit_message>
<xml_diff>
--- a/gdocs_build/Romans.docx
+++ b/gdocs_build/Romans.docx
@@ -192,7 +192,7 @@
               <w:rPr>
                 <w:sz w:val="18"/>
               </w:rPr>
-              <w:t>나 바울임, 예수 그리스도의 사명으로 보내심을 받았음. 나는 그분의 헌신된 종—직접 뽑히신 메신저로, 하나님의 놀라운 능력에 대한 말씀을 전하라고 뽑힌 사람임. 로마에 있는 너네 모두에게 씀—하나님의 친구들, 하나님의 팀, 예수가 부르셔서 그분께 속한 너네에게.</w:t>
+              <w:t>나 바울임, 예수 그리스도의 사명으로 보내심을 받았음. 나는 그분의 헌신된 종—직접 뽑히신 메신저로, 하나님의 놀라운 능력에 대한 말씀을 전하라고 뽑힌 사람임. 로마에 있는 너네 모두에게 씀—하나님의 친구들, 예수가 부르셔서 그분께 속한 너네에게.</w:t>
             </w:r>
           </w:p>
         </w:tc>
@@ -1156,7 +1156,7 @@
               <w:rPr>
                 <w:sz w:val="18"/>
               </w:rPr>
-              <w:t>하나님이 각자에게 받을 만한 걸 정확히 주실 거임. 계속 선을 행하고 옳은 걸 좇으면, 영원한 생명을 얻을 거임. 근데 자기밖에 모르고 진실을 무시하면, 진짜 무서운 결과를 각오해야 함. 악을 선택하는 모든 사람한테는 힘들 거임—누구든 상관없음. 근데 선을 행하는 사람들한테는 놀라울 거임—평화, 명예, 완전히 새 삶. 하나님은 편애 안 하심.</w:t>
+              <w:t>결을 거슬러 가면 가시가 박힘, 어디 출신이든, 부모가 뭘 가르쳤든, 학교를 어디 다녔든 상관없음. 근데 하나님의 방식을 받아들이면 멋진 보상이 있음, 역시 어디서 왔든 어떻게 자랐든 상관없이. 유대인이라고 자동 승인 도장이 찍히는 게 아님. 하나님은 남들이 너에 대해 뭐라 하든(네가 뭐라 생각하든) 신경 안 쓰심. 그분이 직접 판단하심.</w:t>
             </w:r>
           </w:p>
         </w:tc>
@@ -1298,7 +1298,7 @@
               <w:rPr>
                 <w:sz w:val="18"/>
               </w:rPr>
-              <w:t>하나님의 규칙을 들어본 적 없는 사람들도 옳은 일을 할 수 있음. 마치 규칙이 마음에 새겨진 것처럼. 양심이 알려줌. 심판의 날, 하나님은 모든 걸 보실 거임—아무도 모르는 비밀까지도. 예수 그리스도를 통해 다 심판하실 거임, 좋은 소식이 말한 그대로.</w:t>
+              <w:t>하나님의 규칙을 들어본 적 없는 사람들도 옳은 일을 할 수 있음. 마치 규칙이 마음에 새겨진 것처럼. 양심이 알려줌. 심판의 날, 하나님은 모든 걸 보실 거임—아무도 모르는 비밀까지도. 예수 그리스도를 통해 전하는 내가 전하는 메시지가 이 모든 차이를 고려함.</w:t>
             </w:r>
           </w:p>
         </w:tc>
@@ -1485,7 +1485,7 @@
               <w:rPr>
                 <w:sz w:val="18"/>
               </w:rPr>
-              <w:t>할례는 규칙을 실제로 지켜야 의미가 있음. 어기면, 애초에 할례받지 않은 것과 같음. 그리고 할례받지 않은 사람이 규칙을 지키면, 받은 것과 같음. 그러니까, 할례받지 않고 규칙을 지키는 사람들이 너를 판단할 거임—너는 규칙이 적혀 있는데도 계속 망치니까. 할례받고 규칙을 어기는 것보다, 할례받지 않고 하나님의 규칙을 지키는 게 나음. 진짜 유대교는 겉모습에 대한 게 아님. 속마음에 대한 거임. 진짜 할례는 육체적인 게 아님; 영적인 거임. 사람을 감동시키려고 규칙을 지키는 게 아님; 하나님을 감동시키는 변화된 마음을 갖는 거임.</w:t>
+              <w:t>할례는 규칙을 실제로 지켜야 의미가 있음. 어기면, 애초에 할례받지 않은 것과 같음. 그리고 할례받지 않은 사람이 규칙을 지키면, 받은 것과 같음. 할례받고 규칙을 어기는 것보다, 할례받지 않고 하나님의 규칙을 지키는 게 나음. 진짜 유대교는 겉모습에 대한 게 아님. 속마음에 대한 거임. 진짜 할례는 육체적인 게 아님; 영적인 거임. 사람을 감동시키려고 규칙을 지키는 게 아님; 하나님을 감동시키는 변화된 마음을 갖는 거임.</w:t>
             </w:r>
           </w:p>
         </w:tc>
@@ -2450,7 +2450,7 @@
               <w:rPr>
                 <w:sz w:val="18"/>
               </w:rPr>
-              <w:t>하나님은 그리스도 예수를 통해 이 일을 하셨음, 그분이 우리 죄의 값을 치르심으로 우리를 자유롭게 하셨음. 하나님은 예수님을 죄가 용서받는 곳으로 내세우셨고, 다 그분을 신뢰하는 것에 대한 거임. 이건 하나님이 얼마나 공평하신지 보여줌—과거에 사람들이 한 나쁜 짓들을 그냥 무시하지 않으셨음. 인내하시면서 적절한 때를 기다리셨음. 그리고 이제, 그분이 공평하시고 예수님을 신뢰할 때 우리를 바르게 만드신다는 걸 보여주고 계심.</w:t>
+              <w:t>하나님은 그리스도 예수를 통해 이 일을 하셨음, 그분이 우리 죄의 값을 치르심으로 우리를 자유롭게 하셨음. 하나님이 예수님을 희생제물로 보내셔서 세상의 죄를 없애셨고, 그분을 신뢰하는 것에 대한 거임. 이건 하나님이 얼마나 공평하신지 보여줌—과거에 사람들이 한 나쁜 짓들을 그냥 무시하지 않으셨음. 인내하시면서 적절한 때를 기다리셨음. 그리고 이제, 그분이 공평하시고 예수님을 신뢰할 때 우리를 바르게 만드신다는 걸 보여주고 계심.</w:t>
             </w:r>
           </w:p>
         </w:tc>
@@ -2498,7 +2498,7 @@
               <w:rPr>
                 <w:sz w:val="18"/>
               </w:rPr>
-              <w:t>So, what happened to all our bragging about being God's chosen people? It's been canceled. We've learned that God doesn't care about what we do; he cares about what he does. We finally get it. We're in sync with God when we let him lead, not when we're trying to be the star of the show.</w:t>
+              <w:t>So, what happened to all our bragging about being God's chosen people? It's been canceled. We've learned that God does not respond to what we do; we respond to what God does. We finally get it. We're in sync with God when we let him lead, not when we're trying to be the star of the show.</w:t>
             </w:r>
           </w:p>
         </w:tc>
@@ -2846,7 +2846,7 @@
               <w:rPr>
                 <w:sz w:val="18"/>
               </w:rPr>
-              <w:t>자, 우리 믿음의 원조 아브라함은 어떰? 그가 뭘 알아냈음? 착하게 굴어서 자리를 얻었다면, 자랑할 수 있었을 거임. 근데 하나님 앞에서는 안 됨. 성경이 대놓고 말함: '아브라함이 하나님을 믿었고, 그래서 하나님이 그를 의롭다고 선언하셨음.'</w:t>
+              <w:t>자, 우리 믿음의 원조 아브라함은 어떰? 그가 뭘 알아냈음? 착하게 굴어서 자리를 얻었다면, 자랑할 수 있었을 거임. 근데 성경은 아브라함의 하이라이트 영상이 아니라, 하나님의 마스터 플랜에 대한 얘기임. 성경이 대놓고 말함: '아브라함이 하나님을 믿었고, 그래서 하나님이 그를 의롭다고 선언하셨음.'</w:t>
             </w:r>
           </w:p>
         </w:tc>
@@ -2917,7 +2917,7 @@
               <w:rPr>
                 <w:sz w:val="18"/>
               </w:rPr>
-              <w:t>생각해 봐: 열심히 일하면 월급을 받음. 그건 선물이 아님; 번 거임. 근데 일하지 않고 그냥 하나님이 일을 바로잡아주실 거라고 신뢰하면, 그때 네 믿음이 인정됨. 출근 카드를 찍는 게 아님; 보스를 신뢰하는 거임.</w:t>
+              <w:t>생각해 봐: 열심히 일하면 월급을 받음. 그건 선물이 아님; 번 거임. 근데 일이 너한테 너무 커서, 하나님만 하실 수 있는 일이라면 어쩜? 네가 아무리 열심히 오래 해도 절대 못 할 거란 걸 알고, 그분이 처리해주시는 걸 신뢰하면, 그때 네 믿음이 인정됨. 완전한 선물임, 조건 없음.</w:t>
             </w:r>
           </w:p>
         </w:tc>
@@ -3620,7 +3620,7 @@
               <w:rPr>
                 <w:sz w:val="18"/>
               </w:rPr>
-              <w:t>아브라함은 백 살쯤 됐고, 사라는 아이를 가질 수 없었음. 근데 그게 그의 믿음을 흔들게 두지 않았음. 흔들리거나 하나님의 약속을 의심하지 않았음. 대신, 그의 믿음은 더 강해졌고, 하나님께 모든 공을 돌렸음. 하나님이 약속하신 걸 하실 수 있다고 완전히 확신했음. 그래서 하나님이 '너는 나와 잘 됨'이라고 말씀하심. 그리고 그건 아브라함만을 위한 게 아님. 우리를 위한 거기도 함. 예수님을 죽은 자 가운데서 살리신 하나님을 신뢰하면, 우리도 그분과 잘 됨. 예수님은 우리 죄를 위해 돌아가시고, 우리를 하나님과 바르게 하려고 다시 살아나셨음.</w:t>
+              <w:t>아브라함은 백 살쯤 됐고, 사라는 아이를 가질 수 없었음. 근데 그게 그의 믿음을 흔들게 두지 않았음. 흔들리거나 하나님의 약속을 의심하지 않았음. 대신, 그의 믿음은 더 강해졌고, 하나님께 모든 공을 돌렸음. 하나님이 약속하신 걸 하실 수 있다고 완전히 확신했음. 그래서 성경이 말함, '아브라함이 하나님을 신뢰해서 하나님과 바르게 됐음.' 그리고 그건 아브라함만을 위한 게 아님. 우리를 위한 거기도 함. 예수님을 죽은 자 가운데서 살리신 하나님을 신뢰하면, 우리도 그분과 잘 됨. 궁극의 희생제물이신 예수님이 우리를 하나님과 바르게 하시는 분임.</w:t>
             </w:r>
           </w:p>
         </w:tc>
@@ -4016,7 +4016,7 @@
               <w:rPr>
                 <w:sz w:val="18"/>
               </w:rPr>
-              <w:t>이 궁극의 희생 덕분에 이제 하나님과 잘 됐으니, 우리 사이에 앙금은 없음. 우리가 최악일 때 그분의 아들의 희생적인 죽음으로 하나님과 친구가 됐다면, 이제 그분의 팀에 있는 우리의 삶이 부활 생명으로 얼마나 확장되고 깊어질지 상상해 봐! 하나님과의 놀라운 우정을 얻었고, 지루하게 얘기만 하지 않을 거임. 메시아 예수님을 통해 하나님께 찬양을 노래하고 외칠 거임!</w:t>
+              <w:t>이 궁극의 희생 덕분에 이제 하나님과 잘 됐으니, 우리 사이에 앙금은 없음. 우리가 최악일 때 그분의 아들의 희생적인 죽음으로 하나님과 친구가 됐다면, 이제 우리의 삶이 부활 생명으로 얼마나 확장되고 깊어질지 상상해 봐! 하나님과의 놀라운 우정을 얻었고, 지루하게 얘기만 하지 않을 거임. 메시아 예수님을 통해 하나님께 찬양을 노래하고 외칠 거임!</w:t>
             </w:r>
           </w:p>
         </w:tc>
@@ -4180,7 +4180,7 @@
               <w:rPr>
                 <w:sz w:val="18"/>
               </w:rPr>
-              <w:t>But the gift that saves us isn't like the sin that brought death. If one guy's mistake put a whole crowd of people in the timeout corner, separated from God, just think about what God's gift, given through one man, Jesus Christ, will do! You can't even compare the two. That one sin got a death sentence, but the gift that followed all the other sins was a life sentence—in a good way! If death was the boss because of one man's mess-up, imagine how much more those who receive God's overflowing grace will rule in life onto this crazy, extravagant gift of life and being made right with God, all provided by Jesus Christ.</w:t>
+              <w:t>But the gift that saves us isn't like the sin that brought death. If one guy's mistake put a whole crowd of people in the timeout corner, separated from God, just think about what God's gift, given through one man, Jesus Christ, will do! You can't even compare the two. That one sin got a death sentence, but the gift that followed all the other sins was a life sentence—in a good way! If death was the boss because of one man's mess-up, imagine how much more those who receive God's overflowing grace will rule in life, grasping with both hands this crazy, extravagant gift of life and being made right with God, all provided by Jesus Christ.</w:t>
             </w:r>
           </w:p>
         </w:tc>
@@ -4345,7 +4345,7 @@
               <w:rPr>
                 <w:sz w:val="18"/>
               </w:rPr>
-              <w:t>규칙은 그 실수를 더 뻔히 보이게 하려고 나타났음. 근데 죄가 과속한 곳에서, 은혜는 초고속으로 갔음. 죄는 죽음으로 다스렸지만, 은혜는 생명으로 다스림. 그리고 다 예수 그리스도 덕분임, 그분이 우리를 하나님과 바르게 만드시고 영원한 생명을 주심.</w:t>
+              <w:t>죄에 대한 그 모든 규칙은 규칙 어기는 사람을 더 많이 만들었을 뿐임. 근데 죄는 우리가 은혜라고 부르는 초공격적인 용서 앞에서 상대가 안 됨. 죄 대 은혜면, 은혜가 이김, 압도적으로. 죄가 할 수 있는 건 죽음으로 위협하는 거고, 그게 다임. 근데 은혜는, 하나님이 메시아를 통해 모든 걸 다시 맞춰가고 계시니까, 우리를 계속 이어지는 삶으로 초대함, 영원히. 그거에 아멘.</w:t>
             </w:r>
           </w:p>
         </w:tc>
@@ -4505,7 +4505,7 @@
               <w:rPr>
                 <w:sz w:val="18"/>
               </w:rPr>
-              <w:t>So, what's the deal? Should we just keep messing up so God has to keep forgiving us? Like, racking up fouls because you know the ref will just keep calling them? No way, guy. That's a terrible strategy. If we've already ditched the world where sin is the boss, why would we keep a summer home there? Didn't you get the memo? We packed up and moved out for good. That's what baptism is all about. When you went under the water, you basically walked away from your old life of sin. When you came back up, you stepped into a whole new world, an incredible renewal powered by grace.</w:t>
+              <w:t>So, what's the deal? Should we just keep messing up so God has to keep forgiving us? No way. That's a terrible strategy. If we've already ditched the world where sin is the boss, why would we still live in our old house there? Or didn't you realize we packed up and left there for good? That's what baptism is all about. When you went under the water, you basically walked away from your old life of sin. When you came back up, you stepped into a whole new world, an incredible renewal powered by grace.</w:t>
             </w:r>
           </w:p>
         </w:tc>
@@ -4576,7 +4576,7 @@
               <w:rPr>
                 <w:sz w:val="18"/>
               </w:rPr>
-              <w:t>Being baptized into the life of Jesus is like this: going under the water is like being buried with him, and coming up is like his resurrection. Our Father raises each of us into a light-filled world so we can actually see where we're going in our new grace-sovereign country. It's like getting a major life upgrade.</w:t>
+              <w:t>Being baptized into the life of Jesus is like this: going under the water is like being buried with him, and coming up is like his resurrection. Our Father raises each of us into a light-filled world so we can actually see where we're going in our new grace-sovereign country.</w:t>
             </w:r>
           </w:p>
         </w:tc>
@@ -4647,7 +4647,7 @@
               <w:rPr>
                 <w:sz w:val="18"/>
               </w:rPr>
-              <w:t>Let me break it down even more. Our old, cringey self was basically crucified with Christ. That whole miserable life where sin was calling the shots? It's over. Canceled. We're not stuck with its demands anymore. Here's the core belief: if we were part of Christ's death that totally owned sin, we're also part of his resurrection that gives us life. We know that when Jesus came back from the dead, it was the decisive defeat of death itself. Death doesn't get the final say anymore. When Jesus died, he took sin down with him. But now that he's alive, he connects us directly to God. So from now on, think of it like this: sin is a dead language, it's totally irrelevant to you. But God? He's speaking your language, and you should be hanging on every word. You're done with sin and totally alive for God. That's the life Jesus gives you—dead to sin and alive to God.</w:t>
+              <w:t>Let me break it down even more. Our old way of life was nailed to the cross with Christ. That whole miserable life where sin was calling the shots? It's over. Canceled. We're not stuck with its demands anymore. Here's the core belief: if we were part of Christ's sin-conquering death, we're also part of his resurrection that gives us life. We know that when Jesus came back from the dead, it was the decisive defeat of death itself. Death doesn't get the final say anymore. When Jesus died, he took sin down with him. But now that he's alive, he connects us directly to God. So from now on, think of it like this: sin is a dead language, it's totally irrelevant to you. But God? He's speaking your language, and you should be hanging on every word. You're done with sin and totally alive for God. That's the life Jesus gives you—dead to sin and alive to God.</w:t>
             </w:r>
           </w:p>
         </w:tc>
@@ -4670,7 +4670,7 @@
               <w:rPr>
                 <w:sz w:val="18"/>
               </w:rPr>
-              <w:t>이거 완전 당연한 거 아님? 우리의 옛 삶은 그리스도와 함께 십자가에 못 박혔음. 그 비참하고 죄로 가득한 삶은 끝났음. 더 이상 죄한테 휘둘리지 않음! 우리는 믿음. 그리스도의 죽음은 죄를 이긴 죽음이라는 걸. 우리가 그 죽음에 동참했다면, 당연히 그분의 부활, 생명을 구원하는 그 부활에도 동참하는 거임. 예수님이 죽음에서 돌아오셨을 때, 그게 죽음 자체에 대한 궁극의 마이크 드롭이었다는 걸 앎. 죽음은 더 이상 마지막 말을 못 함. 예수님이 돌아가셨을 때, 죄를 끌어내리고 가셨음. 근데 이제 살아나셔서, 우리를 하나님께 직접 연결해주심. 그러니까 이제부터 이렇게 생각함: 죄는 죽은 언어임, 너한테 완전 무관함. 근데 하나님은? 네 언어로 말씀하시고, 너는 한 마디 한 마디에 매달려야 함. 너는 죄와는 끝났고 하나님께는 완전히 살아 있음. 그게 예수님이 주시는 삶임—죄에 대해선 죽고 하나님께는 살아 있음.</w:t>
+              <w:t>이거 완전 당연한 거 아님? 우리의 옛 삶은 그리스도와 함께 십자가에 못 박혔음. 그 비참하고 죄로 가득한 삶은 끝났음. 더 이상 죄한테 휘둘리지 않음! 우리는 믿음. 그리스도의 죽음은 죄를 이긴 죽음이라는 걸. 우리가 그 죽음에 동참했다면, 당연히 그분의 부활, 생명을 구원하는 그 부활에도 동참하는 거임. 예수님이 죽음에서 돌아오셨을 때, 그게 죽음 자체에 대한 결정적 패배였다는 걸 앎. 죽음은 더 이상 마지막 말을 못 함. 예수님이 돌아가셨을 때, 죄를 끌어내리고 가셨음. 근데 이제 살아나셔서, 우리를 하나님께 직접 연결해주심. 그러니까 이제부터 이렇게 생각함: 죄는 죽은 언어임, 너한테 완전 무관함. 근데 하나님은? 네 언어로 말씀하시고, 너는 한 마디 한 마디에 매달려야 함. 너는 죄와는 끝났고 하나님께는 완전히 살아 있음. 그게 예수님이 주시는 삶임—죄에 대해선 죽고 하나님께는 살아 있음.</w:t>
             </w:r>
           </w:p>
         </w:tc>
@@ -4857,7 +4857,7 @@
               <w:rPr>
                 <w:sz w:val="18"/>
               </w:rPr>
-              <w:t>자, 진짜 자유가 뭐임? 하나님이 용서해 주시니까 계속 죄지어도 됨? 그건 말도 안 됨. 죄 속에 계속 살면서 안 따라잡힐 거라고 기대할 순 없음. 네가 죄한테 너를 넘기면, 죄가 네 보스가 됨. 지금까지 네 인생 내내 죄가 하라는 대로 했음. 근데 하나님 감사, 너는 새 주인의 말을 듣기 시작했음, 그분의 명령이 너를 자유롭게 해서 그분의 자유 안에서 활짝 살게 하시는 분! 하나님을 따르면, 절대 안 떨어지는 자유를 얻음.</w:t>
+              <w:t>자, 진짜 자유가 뭐임? 하나님이 용서해 주시니까 계속 죄지어도 됨? 그건 말도 안 됨. 죄 속에 계속 살면서 안 따라잡힐 거라고 기대할 순 없음. 네가 죄한테 너를 넘기면, 죄가 네 보스가 됨—그게 네 마지막 자유 행동이 될 거임. 근데 하나님의 방식에 너를 드리면, 자유는 절대 안 끝남. 지금까지 네 인생 내내 죄가 하라는 대로 했음. 근데 하나님 감사, 너는 새 주인의 말을 듣기 시작했음, 그분의 명령이 너를 자유롭게 해서 그분의 자유 안에서 활짝 살게 하시는 분! 하나님을 따르면, 절대 안 떨어지는 자유를 얻음.</w:t>
             </w:r>
           </w:p>
         </w:tc>
@@ -5656,7 +5656,7 @@
               <w:rPr>
                 <w:sz w:val="18"/>
               </w:rPr>
-              <w:t>It's not really me; it's the sin living inside me. But I need something *more*! I know the law, but I still can't keep it, and the power of sin inside me keeps sabotaging my best intentions. I obviously need help! I realize I don't have what it takes. I can will it, but I can't *do* it. I decide to do good, but I don't *really* do it; I decide not to do bad, but then I do it anyway. My decisions, such as they are, don't result in actions. Something has gone wrong deep within me and gets the better of me every single time.</w:t>
+              <w:t>But I need something *more*! I know the law, but I still can't keep it, and the power of sin inside me keeps sabotaging my best intentions. I obviously need help! I realize I don't have what it takes. I can will it, but I can't *do* it. I decide to do good, but I don't *really* do it; I decide not to do bad, but then I do it anyway. My decisions, such as they are, don't result in actions. Something has gone wrong deep within me and gets the better of me every single time.</w:t>
             </w:r>
           </w:p>
         </w:tc>
@@ -5679,7 +5679,7 @@
               <w:rPr>
                 <w:sz w:val="18"/>
               </w:rPr>
-              <w:t>진짜 내가 하는 게 아님; 내 안에 사는 죄가 하는 거임. 근데 나는 뭔가 *더* 필요함! 규칙을 아는데도 못 지키고, 내 안의 죄의 힘이 내 최선의 의도를 계속 방해함. 분명히 도움이 필요함! 나한테는 안 된다는 걸 깨달음. 의지는 있는데, *실행*이 안 됨. 선을 행하기로 결심하는데, 진짜로는 안 함; 악을 행하지 않기로 결심하는데, 결국 하고 말음. 내 결정은, 있다 치면, 행동으로 이어지지 않음. 내 깊은 곳의 뭔가가 잘못됐고, 매번 나를 이김.</w:t>
+              <w:t>근데 나는 뭔가 *더* 필요함! 규칙을 아는데도 못 지키고, 내 안의 죄의 힘이 내 최선의 의도를 계속 방해함. 분명히 도움이 필요함! 나한테는 안 된다는 걸 깨달음. 의지는 있는데, *실행*이 안 됨. 선을 행하기로 결심하는데, 진짜로는 안 함; 악을 행하지 않기로 결심하는데, 결국 하고 말음. 내 결정은, 있다 치면, 행동으로 이어지지 않음. 내 깊은 곳의 뭔가가 잘못됐고, 매번 나를 이김.</w:t>
             </w:r>
           </w:p>
         </w:tc>
@@ -5892,7 +5892,7 @@
               <w:rPr>
                 <w:sz w:val="18"/>
               </w:rPr>
-              <w:t>답은 예수 그리스도, 우리 주님이심! 하나님 감사! 자, 핵심은 이거임: 마음으로는 하나님의 규칙을 완전히 따르고 싶은데, 행동으로는 아직 죄의 덫에 갇혀 있음.</w:t>
+              <w:t>하나님 감사, 답은 예수 그리스도임! 그분이 이 엉망진창을 고치실 수 있는 분임. 마음과 생각으로 하나님을 온전히 섬기고 싶은데, 죄의 영향에 이끌려 정반대를 하게 되는 이 모순된 삶에서 나를 도우시는 분임.</w:t>
             </w:r>
           </w:p>
         </w:tc>
@@ -6486,7 +6486,7 @@
               <w:rPr>
                 <w:sz w:val="18"/>
               </w:rPr>
-              <w:t>Honestly, the hard times we're going through now are nothing compared to the awesome future that's coming. The created world itself can hardly wait for what's coming next. Everything in creation is being more or less held back. God reins it in until both creation and all the creatures are ready, and then they can be released at the same moment into the glorious times ahead.</w:t>
+              <w:t>Honestly, the hard times we're going through now are nothing compared to the awesome future that's coming. The created world itself can hardly wait for what's coming next. Everything in creation is being more or less held back. God reins it in until both creation and all the creatures are ready, and then they can be released at the same moment into the glorious times ahead. Meanwhile, the joyful anticipation deepens.</w:t>
             </w:r>
           </w:p>
         </w:tc>
@@ -6509,7 +6509,7 @@
               <w:rPr>
                 <w:sz w:val="18"/>
               </w:rPr>
-              <w:t>솔직히, 지금 겪는 힘든 시간은 다가오는 멋진 미래에 비하면 아무것도 아님. 피조 세계 자체가 다음에 올 일을 간절히 기다림. 피조물의 모든 것이 어느 정도 억제되어 있음. 하나님이 피조물과 모든 피조물이 준비될 때까지 붙잡아 두셨다가, 영광의 때에 같은 순간에 함께 풀어주실 거임.</w:t>
+              <w:t>솔직히, 지금 겪는 힘든 시간은 다가오는 멋진 미래에 비하면 아무것도 아님. 피조 세계 자체가 다음에 올 일을 간절히 기다림. 피조물의 모든 것이 어느 정도 억제되어 있음. 하나님이 피조물과 모든 피조물이 준비될 때까지 붙잡아 두셨다가, 영광의 때에 같은 순간에 함께 풀어주실 거임. 한편, 기쁜 기대는 깊어짐.</w:t>
             </w:r>
           </w:p>
         </w:tc>
@@ -6557,7 +6557,7 @@
               <w:rPr>
                 <w:sz w:val="18"/>
               </w:rPr>
-              <w:t>It's like the whole world is pregnant and about to give birth to something amazing. The difficult times of pain throughout the world are simply birth pangs. But it's not only around us; it's within us too. The Spirit of God is arousing us within. We're also feeling the birth pangs. These sterile and barren bodies of ours are yearning for full deliverance. That is why waiting does not make us smaller, any more than waiting makes a pregnant mother smaller. We are enlarged in the waiting. We're waiting for our own life-changing moment, to be totally free. Waiting doesn't make us weaker; it makes us larger, and more joyful in expecting what's coming.</w:t>
+              <w:t>It's like the whole world is pregnant and about to give birth to something amazing. The difficult times of pain throughout the world are simply birth pangs. But it's not only around us; it's within us too. The Spirit of God is arousing us within. We're also feeling the birth pangs. These sterile and barren bodies of ours are yearning for full deliverance. That is why waiting does not make us smaller, any more than waiting makes a pregnant mother smaller. We are enlarged in the waiting. We, of course, don't see what is enlarging us. But the longer we wait, the larger we become, and the more joyful our expectancy.</w:t>
             </w:r>
           </w:p>
         </w:tc>
@@ -6580,7 +6580,7 @@
               <w:rPr>
                 <w:sz w:val="18"/>
               </w:rPr>
-              <w:t>마치 온 세상이 임신해서 놀라운 걸 낳으려는 것처럼. 온 세상의 고통스러운 시간들은 그냥 산통임. 근데 우리 주변만이 아님; 우리 안에도 있음. 하나님의 영이 우리 안에서 우리를 깨우시고 계심. 우리도 산통을 느끼고 있음. 우리의 메마르고 불임인 이 몸이 완전한 해방을 갈망하고 있음. 그래서 기다림이 우리를 작아지게 하지 않음, 기다림이 임산부를 작아지게 하지 않는 것처럼. 우리는 기다리면서 커짐. 인생이 바뀌는 순간, 완전히 자유로워지는 순간을 기다리고 있음. 기다림이 우리를 약하게 만들지 않음; 더 크게, 더 기쁘게 기대하게 만듦.</w:t>
+              <w:t>마치 온 세상이 임신해서 놀라운 걸 낳으려는 것처럼. 온 세상의 고통스러운 시간들은 그냥 산통임. 근데 우리 주변만이 아님; 우리 안에도 있음. 하나님의 영이 우리 안에서 우리를 깨우시고 계심. 우리도 산통을 느끼고 있음. 우리의 메마르고 불임인 이 몸이 완전한 해방을 갈망하고 있음. 그래서 기다림이 우리를 작아지게 하지 않음, 기다림이 임산부를 작아지게 하지 않는 것처럼. 우리는 기다리면서 커짐. 물론 우리를 크게 만드는 게 뭔지 보지는 못함. 근데 기다리면 기다릴수록, 우리는 더 커지고, 기대는 더 기뻐짐.</w:t>
             </w:r>
           </w:p>
         </w:tc>
@@ -6992,7 +6992,7 @@
               <w:rPr>
                 <w:sz w:val="18"/>
               </w:rPr>
-              <w:t>솔직히, 나한테 항상 따라다니는 무거운 슬픔이 있음. 얼마나 깊은지 너네가 알았으면 좋겠음. 절대 안 사라지는 마음의 아픈 고통 같은 거임. 과장 아님. 그리스도가 내가 진실을 말한다는 걸 아심; 성령님이 인도하는 내 양심이 뒷받침함. 도움이 된다면 내 구원을 내 민족, 내 동료 유대인들과 바꾸겠음. 그들은 내 가족임. 그들과 함께 자랐음. 그들은 다 가졌음: 입양, 영광, 언약, 율법, 예배, 약속. 족장들도 가졌고, 그들에게서 메시아가 나오셨는데, 그분은 모든 것 위의 하나님이심. 그분을 영원히 찬양! 아멘.</w:t>
+              <w:t>솔직히, 나한테 항상 따라다니는 무거운 슬픔이 있음. 얼마나 깊은지 너네가 알았으면 좋겠음. 절대 안 사라지는 마음의 아픈 고통 같은 거임. 과장 아님. 그리스도가 내가 진실을 말한다는 걸 아심; 성령님이 인도하는 내 양심이 뒷받침함. 도움이 된다면 내 구원을 내 민족, 내 동료 유대인들과 바꾸겠음. 그들은 내 가족임. 그들과 함께 자랐음. 그들은 다 가졌음: 입양, 영광, 언약, 율법, 예배, 약속. 그들에게서 메시아가 나오셨는데, 그분은 모든 것 위의 하나님이심. 오, 그럼!</w:t>
             </w:r>
           </w:p>
         </w:tc>
@@ -7063,7 +7063,7 @@
               <w:rPr>
                 <w:sz w:val="18"/>
               </w:rPr>
-              <w:t>하나님이 뭔가 잘못하셨다고 1초도 생각하지 마. 문제는 완전 옛날로 거슬러 올라감. 육체적으로 이스라엘의 후손이라고 해서 영적으로 이스라엘인 건 아님. 아브라함의 자식이라고 자동으로 상속자가 되는 게 아님. 하나님이 아브라함에게 말씀하셨음, '이삭을 통해 네 후손이 세어질 거야.' 약속을 기억함: '정해진 때에 내가 돌아올 거고, 사라가 아들을 낳을 거야.' 그건 육체의 자녀가 하나님의 자녀가 아니라, 약속의 자녀라는 뜻임.</w:t>
+              <w:t>하나님이 뭔가 잘못하셨다고 1초도 생각하지 마. 문제는 완전 옛날로 거슬러 올라감. 육체적으로 이스라엘의 후손이라고 해서 영적으로 이스라엘인 건 아님. 아브라함의 자식이라고 자동으로 상속자가 되는 게 아님. 하나님이 아브라함에게 말씀하셨음, '이삭을 통해 네 후손이 세어질 거야.' 약속을 기억함: '정해진 때에 내가 돌아올 거고, 사라가 아들을 낳을 거야.'</w:t>
             </w:r>
           </w:p>
         </w:tc>
@@ -7111,7 +7111,7 @@
               <w:rPr>
                 <w:sz w:val="18"/>
               </w:rPr>
-              <w:t>And it wasn't a one-time thing. Check out what happened with Rebecca's twins, Jacob and Esau. Before they were even born, before they could do anything good or bad, God had already decided the older twin would be second fiddle to the younger one. God's plan isn't some random, hit-or-miss deal. He's the one calling the shots. He said, "Jacob's my boy, but I'm walking away from Esau."</w:t>
+              <w:t>And it wasn't a one-time thing. Check out what happened with Rebecca's twins, Jacob and Esau. Before they were even born, before they could do anything good or bad, God had already decided the older twin would be second fiddle to the younger one. God's plan isn't some random, hit-or-miss deal. He's the one calling the shots. He said, "I loved Jacob; I hated Esau."</w:t>
             </w:r>
           </w:p>
         </w:tc>
@@ -7205,7 +7205,7 @@
               <w:rPr>
                 <w:sz w:val="18"/>
               </w:rPr>
-              <w:t>하나님이 불공평하시다고 불평할 수 있음? 제발, 성급하게 결론내지 마. 하나님이 모세에게 말씀하셨음, '자비를 베풀고 싶은 자에게 자비를 베풀고, 긍휼을 베풀고 싶은 자에게 긍휼을 베풂.' 다시 말하면, 우리가 더 열심히 노력하거나 더 빨리 뛰는 게 아님. 다 하나님의 자비에 대한 거임. 바로에게도 말씀하셨음, '너를 여기에 둔 건 모두가 내가 할 수 있는 걸 보게 하고, 내 이름이 어디서나 유명해지게 하려는 거야.' 그래서, 하나님이 주관하심. 자비를 베풀고 싶은 자에게 베푸시고, 완고하게 하고 싶은 자는 완고하게 하심.</w:t>
+              <w:t>하나님이 불공평하시다고 불평할 수 있음? 제발, 성급하게 결론내지 마. 하나님이 모세에게 말씀하셨음, '자비를 베풀고 싶은 자에게 자비를 베풀고, 긍휼을 베풀고 싶은 자에게 긍휼을 베풂.' 다시 말하면, 우리가 더 열심히 노력하거나 더 빨리 뛰는 게 아님. 다 하나님의 자비에 대한 거임. 바로에게도 말씀하셨음, '너를 이 구원 드라마의 조연으로 뽑았음.' 우리가 말하는 건 다 하나님이 먼저 말씀하시고, 우리가 좋은 쪽으로든 나쁜 쪽으로든 우리 역할을 하는 행동을 시작하신다는 거임.</w:t>
             </w:r>
           </w:p>
         </w:tc>
@@ -7705,7 +7705,7 @@
               <w:rPr>
                 <w:sz w:val="18"/>
               </w:rPr>
-              <w:t>For real, all I want is for my people, the Israelites, to be saved. I'm praying for it 24/7. They're super passionate about God, I'll give them that, but they're going about it all wrong. They're trying to earn their way to God by following a bunch of rules, like it's a DIY project. They've set up their own little 'salvation stores' selling fakes, when God's got the real deal right there. They've been trying to do it their own way for ages, and they've got nothing to show for it. The earlier revelation was meant to get us ready for the Messiah, who then puts everything right for those who trust him to do it.</w:t>
+              <w:t>For real, all I want is for my people, the Israelites, to be saved. I'm praying for it 24/7. They're super passionate about God, I'll give them that, but they're going about it all wrong. They're trying to earn their way to God by following a bunch of rules, like it's a DIY project. They've set up their own little 'salvation stores' selling fakes, when God's got the real deal right there. They've been trying to do it their own way for ages, and they've got nothing to show for it.</w:t>
             </w:r>
           </w:p>
         </w:tc>
@@ -7728,7 +7728,7 @@
               <w:rPr>
                 <w:sz w:val="18"/>
               </w:rPr>
-              <w:t>진짜로, 내 민족 이스라엘 사람들이 구원받는 게 내가 원하는 전부임. 24시간 기도함. 그들이 하나님에 대해 엄청 열정적인 건 인정함, 근데 완전히 잘못 가고 있음. 규칙 잔뜩 지키면서 하나님께 가는 길을 벌려고 함, 마치 DIY 프로젝트처럼. 자기들만의 작은 '구원 상점'을 차려서 가짜를 팔고 있음, 하나님이 바로 거기에 진짜를 갖고 계신데. 오랫동안 자기들 방식대로 해왔는데, 남은 게 하나도 없음. 이전 계시는 메시아를 맞이할 준비를 시키려는 거였고, 그 메시아가 그분을 신뢰하는 사람들을 위해 모든 걸 바로잡으심.</w:t>
+              <w:t>진짜로, 내 민족 이스라엘 사람들이 구원받는 게 내가 원하는 전부임. 24시간 기도함. 그들이 하나님에 대해 엄청 열정적인 건 인정함, 근데 완전히 잘못 가고 있음. 규칙 잔뜩 지키면서 하나님께 가는 길을 벌려고 함, 마치 DIY 프로젝트처럼. 자기들만의 작은 '구원 상점'을 차려서 가짜를 팔고 있음, 하나님이 바로 거기에 진짜를 갖고 계신데. 오랫동안 자기들 방식대로 해왔는데, 남은 게 하나도 없음.</w:t>
             </w:r>
           </w:p>
         </w:tc>
@@ -7973,7 +7973,7 @@
               <w:rPr>
                 <w:sz w:val="18"/>
               </w:rPr>
-              <w:t>근데 들어본 적도 없는 분을 어떻게 부름? 아무도 그분에 대해 말하지 않으면 어떻게 들음? 보내심을 받지 않으면 누가 그분에 대해 말할 수 있음? 성경이 말한 것처럼: '좋은 소식을 전하는 사람들의 발이 얼마나 멋진가!' 근데 모두가 들을 준비가 된 건 아님. 이사야 선지자도 물었음, '하나님, 듣는 사람이 있긴 함?' 그러니까 믿으려면 먼저 메시지를 들어야 함. 그리고 예수님에 대해 말하는 사람이 없으면 들을 메시지도 없음.</w:t>
+              <w:t>근데 누구를 믿어야 할지 모르는 분을 어떻게 도움 달라고 부름? 들어본 적도 없는 분을 어떻게 부름? 아무도 그분에 대해 말하지 않으면 어떻게 들음? 보내심을 받지 않으면 누가 그분에 대해 말할 수 있음? 성경이 외친 것처럼: 좋은 소식을 전하는 사람들은 숨이 멎을 만큼 멋진 광경임! 근데 모두가 들을 준비가 된 건 아님. 이사야 선지자도 물었음, '하나님, 듣는 사람이 있긴 함?' 그러니까 믿으려면 먼저 메시지를 들어야 함. 그리고 예수님에 대해 말하는 사람이 없으면 들을 메시지도 없음.</w:t>
             </w:r>
           </w:p>
         </w:tc>
@@ -8100,7 +8100,7 @@
               <w:rPr>
                 <w:sz w:val="18"/>
               </w:rPr>
-              <w:t>근데 잠깐. 그들이 진짜 못 들음? 물론 들었음. 마치 온 세상이 공지를 받은 것처럼. 근데 못 알아들었음. 모세도 힌트를 주려고 했음: 하나님이 외부인을 써서 그들을 질투하게 하실 거라고. 그다음 이사야는 그냥 대놓고 말했음: 하나님이 그분을 찾지도 않던 사람들을 찾으셨다고. 그리고 나서 그는 이스라엘을 향해 날마다 손을 내밀었는데, 돌아온 건 읽씹뿐이었다고 말했음.</w:t>
+              <w:t>근데 잠깐. 그들이 진짜 못 들음? 물론 들었음. 마치 온 세상이 공지를 받은 것처럼. 근데 못 알아들었음. 모세도 힌트를 주려고 했음: 하나님이 외부인을 써서 그들을 질투하게 하실 거라고. 하나님이 멍청하다고 생각한 사람들과 잘 지내는 걸 보면, 뚜껑이 열릴 거라고. 그다음 이사야는 그냥 대놓고 말했음: 하나님이 그분을 찾지도 않던 사람들을 찾으셨다고. 그리고 나서 그는 이스라엘을 향해 날마다 손을 내밀었는데, 돌아온 건 침묵뿐이었다고 말했음.</w:t>
             </w:r>
           </w:p>
         </w:tc>
@@ -8386,7 +8386,7 @@
               <w:rPr>
                 <w:sz w:val="18"/>
               </w:rPr>
-              <w:t>엘리야에 대해 성경이 뭐라고 하는지 기억 안 남? 그가 이스라엘 사람들에 대해 하나님께 불평했음: '하나님, 그들이 주의 선지자들을 죽이고 주의 제단을 헐었어요. 나만 남았는데, 이제 나까지 죽이려고 해요!' 근데 하나님이 말씀하셨음, '조용히 해, 엘리야! 바알에게 무릎 꿇지 않은 7,000명이 또 있음. 그리고 그들은 여전히 여기 있고, 버티고 있음.' 지금도 같음. 하나님이 너그러우셔서 택하신 작은 무리가 있음. 그리고 너그러우셔서라면, 그들이 한 일 때문이 아님. 그렇지 않으면 너그러움이 너그러움이 아님.</w:t>
+              <w:t>엘리야에 대해 성경이 뭐라고 하는지 기억 안 남? 그가 이스라엘 사람들에 대해 하나님께 불평했음: '하나님, 그들이 주의 선지자들을 죽이고 주의 제단을 헐었어요. 나만 남았는데, 이제 나까지 죽이려고 해요!' 근데 하나님이 말씀하셨음, '조용히 해, 엘리야! 바알에게 무릎 꿇지 않은 7,000명이 또 있음. 그리고 그들은 여전히 여기 있고, 버티고 있음.' 지금도 같음. 여전히 버티는 작지만 엄청 충성스러운 무리가 있음. 그들은 얻을 수 있는 걸 노리는 게 아님; 그냥 하나님의 은혜와 그분의 계획에 올인한 거임. 자기들 생각만 했다면, 진작에 떠났을 거임.</w:t>
             </w:r>
           </w:p>
         </w:tc>
@@ -8458,7 +8458,7 @@
               <w:rPr>
                 <w:sz w:val="18"/>
               </w:rPr>
-              <w:t>So what's the deal? When Israel tried to do things their own way, they didn't get what they were after. The selected few got a firm grip on God and his promises. But the rest are still fumbling around. Scripture says it like this: God put them into a deep sleep. He shut their eyes. He plugged their ears. So they never got to see, hear, or think about what was going on. David said it even better: Let their table become a trap, a trap for catching them in the act. Let their eyes be blinded and their backs be bent. Let them stay that way!</w:t>
+              <w:t>So what's the deal? When Israel tried to do things their own way, they didn't get what they were after. The chosen ones were the ones who let God pursue his own plan in them, and they got his stamp of approval. But the rest are still fumbling around. Scripture says it like this: God put them into a deep sleep. He shut their eyes. He plugged their ears. So they never got to see, hear, or think about what was going on. David was upset about the same thing: I hope they get sick eating self-serving meals, break a leg walking their self-serving ways. I hope they go blind staring in their mirrors, get ulcers from playing at god.</w:t>
             </w:r>
           </w:p>
         </w:tc>
@@ -8481,7 +8481,7 @@
               <w:rPr>
                 <w:sz w:val="18"/>
               </w:rPr>
-              <w:t>그래서, 어떻게 됐음? 이스라엘 사람들은 찾던 걸 얻지 못했지만, 택함 받은 사람들은 얻었음. 나머지는 눈이 멀었음. 성경이 말한 것처럼: '하나님이 그들을 보지도 듣지도 못하게 만드셨음. 꼼짝 못 함.' 그리고 다윗이 말했음: '그들의 밥상이 덫이 되게 하소서. 받을 걸 받게 하소서. 눈멀게 하시고 계속 구부러지게 하소서.'</w:t>
+              <w:t>그래서, 어떻게 됐음? 이스라엘 사람들은 찾던 걸 얻지 못했지만, 택함 받은 사람들은 얻었음. 나머지는 눈이 멀었음. 성경이 말한 것처럼: '하나님이 그들을 보지도 듣지도 못하게 만드셨음. 꼼짝 못 함.' 그리고 다윗도 같은 일로 속상했음: 자기 이익만 차리는 밥 먹다가 체했으면 좋겠고, 자기 이익만 차리는 길 걷다가 다리 부러졌으면 좋겠음. 거울만 쳐다보다 눈멀고, 신인 척하다 속병 났으면 좋겠음.</w:t>
             </w:r>
           </w:p>
         </w:tc>
@@ -8668,7 +8668,7 @@
               <w:rPr>
                 <w:sz w:val="18"/>
               </w:rPr>
-              <w:t>자, 이제 비유대인 너네한테 말함. 너네를 위한 사도니까, 내 일을 진짜 진지하게 받음. 혹시 내 민족을 질투하게 해서 그들 중 몇이라도 구원할 수 있을지도. 그들이 버림받은 게 세상이 하나님과 화해한다는 뜻이라면, 그들이 받아들여질 때는 무슨 일이 일어날까? 죽은 자 가운데서 생명 같은 거일 거임!</w:t>
+              <w:t>자, 이제 비유대인 너네한테 말함. 너네를 위한 사도니까, 내 일을 진짜 진지하게 받음. 혹시 내 민족을 질투하게 해서 그들 중 몇이라도 구원할 수 있을지도. 그들이 망쳐서 너한테 좋은 일이 생겼다면, 그들이 제대로 할 때 얼마나 멋질지 생각해 봐. 엄청난 홈커밍이 될 거임!</w:t>
             </w:r>
           </w:p>
         </w:tc>
@@ -9203,7 +9203,7 @@
               <w:rPr>
                 <w:sz w:val="18"/>
               </w:rPr>
-              <w:t>There was a time when you were on the outside looking in. You turned down God's invitations and went your own way. But then the Jews turned down God's invitation, and that opened things up for you. Now they're the ones on the outside, looking in. God has been making sure that everyone gets a turn at being on the outside. It's all part of his plan to bring everyone in.</w:t>
+              <w:t>There was a time when you were on the outside looking in. You turned down God's invitations and went your own way. But then the Jews turned down God's invitation, and that opened things up for you. Now they're the ones on the outside, looking in. But with the door held wide open for you, they have a way back in. God has been making sure that everyone gets a turn at being on the outside. It's all part of his plan to bring everyone in.</w:t>
             </w:r>
           </w:p>
         </w:tc>
@@ -9226,7 +9226,7 @@
               <w:rPr>
                 <w:sz w:val="18"/>
               </w:rPr>
-              <w:t>얼마 전만 해도, 너네가 밖에서 안을 들여다보는 쪽이었음. 하나님의 초대를 거절하고 자기 길로 갔음. 근데 유대인들이 하나님의 초대를 거절하면서, 너네한테 기회가 열렸음. 이제 그들이 밖에 있고, 안을 들여다봄. 하나님은 모두가 밖에 있는 차례를 갖게 하셔서, 그분이 우리 모두를 안으로 데려오는 계획의 일부로 삼으심.</w:t>
+              <w:t>얼마 전만 해도, 너네가 밖에서 안을 들여다보는 쪽이었음. 하나님의 초대를 거절하고 자기 길로 갔음. 근데 유대인들이 하나님의 초대를 거절하면서, 너네한테 기회가 열렸음. 이제 그들이 밖에 있고, 안을 들여다봄. 근데 너네한테 문이 활짝 열려 있으니까, 그들도 다시 들어올 길이 있음. 하나님은 모두가 밖에 있는 차례를 갖게 하셔서, 그분이 우리 모두를 안으로 데려오는 계획의 일부로 삼으심.</w:t>
             </w:r>
           </w:p>
         </w:tc>
@@ -10247,7 +10247,7 @@
               <w:rPr>
                 <w:sz w:val="18"/>
               </w:rPr>
-              <w:t>좋은 시민이 돼. 모든 정부는 하나님 아래 있음. 평화와 질서가 있는 한, 그건 하나님의 질서임. 그러니까 시민으로서 책임감 있게 살아. 국가에 무책임하면, 하나님께도 무책임한 거고, 하나님이 너를 불러서 책임을 물으실 거임.</w:t>
+              <w:t>좋은 시민이 돼. 모든 정부는 하나님 아래 있음. 평화와 질서가 있는 한, 그건 하나님의 질서임. 그러니까 시민으로서 책임감 있게 살아. 국가에 무책임하면, 하나님께도 무책임한 거고, 하나님이 너를 불러서 책임을 물으실 거임. 권력자들은 네가 뭔가 꼼수를 쓰려 할 때만 문제가 됨. 그냥 네 삶을 살면, 걱정할 거 하나도 없음.</w:t>
             </w:r>
           </w:p>
         </w:tc>
@@ -12584,7 +12584,7 @@
               <w:rPr>
                 <w:sz w:val="18"/>
               </w:rPr>
-              <w:t>Next, big shout-out to Priscilla and Aquila, my fellow workers in Christ Jesus. These two risked their lives for me. I'm not the only one who's grateful; all the non-Jewish churches owe them big time. And what's super cool is they host a church right in their own house. Talk about squad goals! Give a holler to my boy Epenetus, the very first person in Asia to jump on board with Team Jesus.</w:t>
+              <w:t>Next, big shout-out to Priscilla and Aquila, my fellow workers in Christ Jesus. These two risked their lives for me. I'm not the only one who's grateful; all the non-Jewish churches owe them big time. And what's super cool is they host a church right in their own house. Give a warm hello to my dear friend Epenetus, the very first follower of Jesus in the province of Asia.</w:t>
             </w:r>
           </w:p>
         </w:tc>
@@ -13531,7 +13531,7 @@
               <w:rPr>
                 <w:sz w:val="18"/>
               </w:rPr>
-              <w:t>I'm so proud of you guys because you're known for being the real deal. But I also want you to be street smart. Know the difference between what's good and what's just a good-looking fake. Don't be naive when it comes to evil. Stay sharp, and before you know it, the God of peace will totally crush Satan under your feet. Enjoy all the good stuff Jesus has for you!</w:t>
+              <w:t>I'm so proud of you guys because you're known for being the real deal. But I also want you to be smart, Know the difference between what's good and what's just a good-looking fake. Don't be naive when it comes to evil. Stay sharp, and before you know it, the God of peace will totally crush Satan under your feet. Enjoy all the good stuff Jesus has for you!</w:t>
             </w:r>
           </w:p>
         </w:tc>
@@ -13554,7 +13554,7 @@
               <w:rPr>
                 <w:sz w:val="18"/>
               </w:rPr>
-              <w:t>너네가 진짜배기로 알려진 게 너무 자랑스러움. 근데 street smart도 됐으면 좋겠음. 진짜 좋은 것과 좋아 보이는 가짜의 차이를 알아. 악에 대해서는 순진하지 마. 날카롭게 있어, 그러면 어느새 평화의 하나님이 사탄을 너네 발밑에 완전히 짓밟아버리실 거임. 예수님이 너를 위해 준비하신 모든 좋은 걸 누려!</w:t>
+              <w:t>너네가 진짜배기로 알려진 게 너무 자랑스러움. 근데 현명해졌으면 좋겠음. 진짜 좋은 것과 좋아 보이는 가짜의 차이를 알아. 악에 대해서는 순진하지 마. 날카롭게 있어, 그러면 어느새 평화의 하나님이 사탄을 너네 발밑에 완전히 짓밟아버리실 거임. 예수님이 너를 위해 준비하신 모든 좋은 걸 누려!</w:t>
             </w:r>
           </w:p>
         </w:tc>

</xml_diff>